<commit_message>
Edit cards; continue refining code
</commit_message>
<xml_diff>
--- a/Rules Book.docx
+++ b/Rules Book.docx
@@ -552,7 +552,15 @@
         </w:numPr>
       </w:pPr>
       <w:r>
-        <w:t>After receiving ACE points, if you are located in zones of unfavourable environment, your intensity will drop by:</w:t>
+        <w:t xml:space="preserve">After receiving ACE points, if you </w:t>
+      </w:r>
+      <w:proofErr w:type="gramStart"/>
+      <w:r>
+        <w:t>are located in</w:t>
+      </w:r>
+      <w:proofErr w:type="gramEnd"/>
+      <w:r>
+        <w:t xml:space="preserve"> zones of unfavourable environment, your intensity will drop by:</w:t>
       </w:r>
     </w:p>
     <w:tbl>
@@ -804,40 +812,31 @@
         <w:t>is</w:t>
       </w:r>
       <w:r>
-        <w:t xml:space="preserve"> a total of 1</w:t>
-      </w:r>
-      <w:r>
-        <w:rPr>
-          <w:rFonts w:hint="eastAsia"/>
-        </w:rPr>
-        <w:t>8</w:t>
+        <w:t xml:space="preserve"> a total of </w:t>
+      </w:r>
+      <w:r>
+        <w:t>2</w:t>
+      </w:r>
+      <w:r>
+        <w:t>5</w:t>
       </w:r>
       <w:r>
         <w:t xml:space="preserve">0 cards, including </w:t>
       </w:r>
       <w:r>
-        <w:rPr>
-          <w:rFonts w:hint="eastAsia"/>
-        </w:rPr>
-        <w:t>75</w:t>
+        <w:t>100</w:t>
       </w:r>
       <w:r>
         <w:t xml:space="preserve"> movement cards, </w:t>
       </w:r>
       <w:r>
-        <w:rPr>
-          <w:rFonts w:hint="eastAsia"/>
-        </w:rPr>
-        <w:t>75</w:t>
+        <w:t>100</w:t>
       </w:r>
       <w:r>
         <w:t xml:space="preserve"> intensity cards, and </w:t>
       </w:r>
       <w:r>
-        <w:rPr>
-          <w:rFonts w:hint="eastAsia"/>
-        </w:rPr>
-        <w:t>3</w:t>
+        <w:t>5</w:t>
       </w:r>
       <w:r>
         <w:rPr>

</xml_diff>

<commit_message>
Updates to cards, rule book and code
</commit_message>
<xml_diff>
--- a/Rules Book.docx
+++ b/Rules Book.docx
@@ -334,9 +334,6 @@
       <w:r>
         <w:t>Each storm will begin with an intensity of 25 knots.</w:t>
       </w:r>
-      <w:r>
-        <w:t xml:space="preserve"> Place another pawn of your colour on the 25 knots box on the intensity bar.</w:t>
-      </w:r>
     </w:p>
     <w:p>
       <w:pPr>
@@ -365,13 +362,7 @@
         <w:t xml:space="preserve"> 4 movement cards, 4 intensity cards, and 2 action cards.</w:t>
       </w:r>
     </w:p>
-    <w:p>
-      <w:pPr>
-        <w:rPr>
-          <w:lang w:val="en-GB"/>
-        </w:rPr>
-      </w:pPr>
-    </w:p>
+    <w:p/>
     <w:p/>
     <w:p>
       <w:r>
@@ -425,7 +416,25 @@
       <w:pPr>
         <w:pStyle w:val="ListParagraph"/>
         <w:numPr>
-          <w:ilvl w:val="0"/>
+          <w:ilvl w:val="1"/>
+          <w:numId w:val="2"/>
+        </w:numPr>
+      </w:pPr>
+      <w:r>
+        <w:t>Rather than using a card, you can also choose to discard a card and get a replacement card</w:t>
+      </w:r>
+      <w:r>
+        <w:t xml:space="preserve"> from the same deck</w:t>
+      </w:r>
+      <w:r>
+        <w:t>.</w:t>
+      </w:r>
+    </w:p>
+    <w:p>
+      <w:pPr>
+        <w:pStyle w:val="ListParagraph"/>
+        <w:numPr>
+          <w:ilvl w:val="1"/>
           <w:numId w:val="2"/>
         </w:numPr>
       </w:pPr>
@@ -463,13 +472,7 @@
         </w:numPr>
       </w:pPr>
       <w:r>
-        <w:t xml:space="preserve">If your storm makes landfall on a city, you will receive landfall costs from the city. Mark down your landfalling city </w:t>
-      </w:r>
-      <w:r>
-        <w:t>on your scoreboard</w:t>
-      </w:r>
-      <w:r>
-        <w:t xml:space="preserve">. (See </w:t>
+        <w:t xml:space="preserve">If your storm makes landfall on a city, you will receive landfall costs from the city. (See </w:t>
       </w:r>
       <w:r>
         <w:rPr>
@@ -513,54 +516,7 @@
         </w:numPr>
       </w:pPr>
       <w:r>
-        <w:t xml:space="preserve">If you have reached </w:t>
-      </w:r>
-      <w:r>
-        <w:t>a new peak intensity</w:t>
-      </w:r>
-      <w:r>
-        <w:t>,</w:t>
-      </w:r>
-      <w:r>
-        <w:t xml:space="preserve"> mark</w:t>
-      </w:r>
-      <w:r>
-        <w:t xml:space="preserve"> down </w:t>
-      </w:r>
-      <w:r>
-        <w:t xml:space="preserve">the </w:t>
-      </w:r>
-      <w:r>
-        <w:t>intensity</w:t>
-      </w:r>
-      <w:r>
-        <w:t xml:space="preserve"> you have reached</w:t>
-      </w:r>
-      <w:r>
-        <w:t xml:space="preserve"> on your scoreboard</w:t>
-      </w:r>
-      <w:r>
-        <w:t>.</w:t>
-      </w:r>
-    </w:p>
-    <w:p>
-      <w:pPr>
-        <w:pStyle w:val="ListParagraph"/>
-        <w:numPr>
-          <w:ilvl w:val="0"/>
-          <w:numId w:val="2"/>
-        </w:numPr>
-      </w:pPr>
-      <w:r>
-        <w:t xml:space="preserve">After receiving ACE points, if you </w:t>
-      </w:r>
-      <w:proofErr w:type="gramStart"/>
-      <w:r>
-        <w:t>are located in</w:t>
-      </w:r>
-      <w:proofErr w:type="gramEnd"/>
-      <w:r>
-        <w:t xml:space="preserve"> zones of unfavourable environment, your intensity will drop by:</w:t>
+        <w:t>After receiving ACE points, if you are located in zones of unfavourable environment, your intensity will drop by:</w:t>
       </w:r>
     </w:p>
     <w:tbl>
@@ -1614,6 +1570,24 @@
         </w:numPr>
       </w:pPr>
       <w:r>
+        <w:t xml:space="preserve">Instant Teleportation: </w:t>
+      </w:r>
+      <w:r>
+        <w:t>Teleport to a genesis point of your choice</w:t>
+      </w:r>
+      <w:r>
+        <w:t>.</w:t>
+      </w:r>
+    </w:p>
+    <w:p>
+      <w:pPr>
+        <w:pStyle w:val="ListParagraph"/>
+        <w:numPr>
+          <w:ilvl w:val="1"/>
+          <w:numId w:val="2"/>
+        </w:numPr>
+      </w:pPr>
+      <w:r>
         <w:t xml:space="preserve">Survival of the Fittest: Be immune </w:t>
       </w:r>
       <w:r>
@@ -1673,6 +1647,18 @@
       <w:r>
         <w:t>.</w:t>
       </w:r>
+      <w:r>
+        <w:t xml:space="preserve"> </w:t>
+      </w:r>
+      <w:r>
+        <w:t>(</w:t>
+      </w:r>
+      <w:r>
+        <w:t>Players can still move onto that city, but</w:t>
+      </w:r>
+      <w:r>
+        <w:t xml:space="preserve"> will not be able to earn any landfall costs)</w:t>
+      </w:r>
     </w:p>
     <w:p>
       <w:pPr>
@@ -1686,7 +1672,7 @@
         <w:t>Expand Circulation: Impact one city of your choice at an adjacent grid box. (Cannot affect diagonal cities)</w:t>
       </w:r>
       <w:r>
-        <w:t xml:space="preserve"> (All players will not be able to earn any landfall costs from that city)</w:t>
+        <w:t xml:space="preserve"> </w:t>
       </w:r>
     </w:p>
     <w:p>
@@ -1698,7 +1684,22 @@
         </w:numPr>
       </w:pPr>
       <w:r>
-        <w:t>Random Teleportation: Roll two dice and teleport to the genesis point labelled with the number you rolled.</w:t>
+        <w:t xml:space="preserve">Breaking Free: </w:t>
+      </w:r>
+      <w:r>
+        <w:t>Remove all negative effects affecting yourself</w:t>
+      </w:r>
+    </w:p>
+    <w:p>
+      <w:pPr>
+        <w:pStyle w:val="ListParagraph"/>
+        <w:numPr>
+          <w:ilvl w:val="1"/>
+          <w:numId w:val="2"/>
+        </w:numPr>
+      </w:pPr>
+      <w:r>
+        <w:t>Extra Time: Be able to use at most 6 cards within this round.</w:t>
       </w:r>
     </w:p>
     <w:p>
@@ -1726,36 +1727,6 @@
       </w:r>
       <w:r>
         <w:t>from the deck. (Doesn’t matter how many cards you originally have. You won’t be allowed to keep any of your current cards)</w:t>
-      </w:r>
-    </w:p>
-    <w:p>
-      <w:pPr>
-        <w:pStyle w:val="ListParagraph"/>
-        <w:numPr>
-          <w:ilvl w:val="1"/>
-          <w:numId w:val="2"/>
-        </w:numPr>
-      </w:pPr>
-      <w:r>
-        <w:t>Extra Time: Be able to use at most 6 cards within this round.</w:t>
-      </w:r>
-    </w:p>
-    <w:p>
-      <w:pPr>
-        <w:pStyle w:val="ListParagraph"/>
-        <w:numPr>
-          <w:ilvl w:val="1"/>
-          <w:numId w:val="2"/>
-        </w:numPr>
-      </w:pPr>
-      <w:r>
-        <w:t>Breaking Free</w:t>
-      </w:r>
-      <w:r>
-        <w:t xml:space="preserve">: </w:t>
-      </w:r>
-      <w:r>
-        <w:t>Remove all negative effects affecting yourself</w:t>
       </w:r>
     </w:p>
     <w:p>
@@ -2127,6 +2098,7 @@
       </w:r>
     </w:p>
     <w:p/>
+    <w:p/>
     <w:p>
       <w:r>
         <w:rPr>
@@ -2305,18 +2277,6 @@
         </w:numPr>
       </w:pPr>
       <w:r>
-        <w:t>Within each round, you can receive landfall costs from only one city.</w:t>
-      </w:r>
-    </w:p>
-    <w:p>
-      <w:pPr>
-        <w:pStyle w:val="ListParagraph"/>
-        <w:numPr>
-          <w:ilvl w:val="0"/>
-          <w:numId w:val="2"/>
-        </w:numPr>
-      </w:pPr>
-      <w:r>
         <w:t>You</w:t>
       </w:r>
       <w:r>
@@ -2336,18 +2296,6 @@
       </w:r>
       <w:r>
         <w:t>again at a higher intensity.</w:t>
-      </w:r>
-    </w:p>
-    <w:p>
-      <w:pPr>
-        <w:pStyle w:val="ListParagraph"/>
-        <w:numPr>
-          <w:ilvl w:val="0"/>
-          <w:numId w:val="2"/>
-        </w:numPr>
-      </w:pPr>
-      <w:r>
-        <w:t xml:space="preserve">Remember to mark the city on your scoreboard sheet each time you make landfall. </w:t>
       </w:r>
     </w:p>
     <w:p>
@@ -3404,10 +3352,13 @@
               <w:t>2</w:t>
             </w:r>
             <w:r>
+              <w:t>5</w:t>
+            </w:r>
+            <w:r>
               <w:rPr>
                 <w:rFonts w:hint="eastAsia"/>
               </w:rPr>
-              <w:t>00</w:t>
+              <w:t>0</w:t>
             </w:r>
           </w:p>
         </w:tc>
@@ -3549,10 +3500,13 @@
               <w:t>2</w:t>
             </w:r>
             <w:r>
+              <w:t>5</w:t>
+            </w:r>
+            <w:r>
               <w:rPr>
                 <w:rFonts w:hint="eastAsia"/>
               </w:rPr>
-              <w:t>00</w:t>
+              <w:t>0</w:t>
             </w:r>
           </w:p>
         </w:tc>

</xml_diff>

<commit_message>
Minor updates on code and rules
</commit_message>
<xml_diff>
--- a/Rules Book.docx
+++ b/Rules Book.docx
@@ -362,7 +362,6 @@
         <w:t xml:space="preserve"> 4 movement cards, 4 intensity cards, and 2 action cards.</w:t>
       </w:r>
     </w:p>
-    <w:p/>
     <w:p/>
     <w:p>
       <w:r>
@@ -1600,7 +1599,13 @@
         </w:numPr>
       </w:pPr>
       <w:r>
-        <w:t>Eyewall Replacement: Stop one opponent of your choice from intensifying for 3 rounds. (That opponent cannot use any intensity cards, but will still suffer weakening if within zones of unfavourable environment)</w:t>
+        <w:t xml:space="preserve">Eyewall Replacement: Stop one opponent of your choice from intensifying for </w:t>
+      </w:r>
+      <w:r>
+        <w:t>2</w:t>
+      </w:r>
+      <w:r>
+        <w:t xml:space="preserve"> rounds. (That opponent cannot use any intensity cards, but will still suffer weakening if within zones of unfavourable environment)</w:t>
       </w:r>
     </w:p>
     <w:p>
@@ -2073,16 +2078,130 @@
         </w:numPr>
       </w:pPr>
       <w:r>
-        <w:t xml:space="preserve">The ocean has an initial ACE of 500 </w:t>
-      </w:r>
-      <w:r>
-        <w:t>multiplied</w:t>
-      </w:r>
-      <w:r>
-        <w:t xml:space="preserve"> by the number of players.</w:t>
-      </w:r>
-    </w:p>
-    <w:p/>
+        <w:t>The ocean has an initial ACE</w:t>
+      </w:r>
+      <w:r>
+        <w:t xml:space="preserve"> based on the number of players:</w:t>
+      </w:r>
+    </w:p>
+    <w:tbl>
+      <w:tblPr>
+        <w:tblStyle w:val="TableGrid"/>
+        <w:tblW w:w="0" w:type="auto"/>
+        <w:tblLook w:val="04A0" w:firstRow="1" w:lastRow="0" w:firstColumn="1" w:lastColumn="0" w:noHBand="0" w:noVBand="1"/>
+      </w:tblPr>
+      <w:tblGrid>
+        <w:gridCol w:w="2122"/>
+        <w:gridCol w:w="1098"/>
+        <w:gridCol w:w="1099"/>
+        <w:gridCol w:w="1098"/>
+        <w:gridCol w:w="1099"/>
+      </w:tblGrid>
+      <w:tr>
+        <w:tc>
+          <w:tcPr>
+            <w:tcW w:w="2122" w:type="dxa"/>
+          </w:tcPr>
+          <w:p>
+            <w:r>
+              <w:t>Number of Players</w:t>
+            </w:r>
+          </w:p>
+        </w:tc>
+        <w:tc>
+          <w:tcPr>
+            <w:tcW w:w="1098" w:type="dxa"/>
+          </w:tcPr>
+          <w:p>
+            <w:r>
+              <w:t>2</w:t>
+            </w:r>
+          </w:p>
+        </w:tc>
+        <w:tc>
+          <w:tcPr>
+            <w:tcW w:w="1099" w:type="dxa"/>
+          </w:tcPr>
+          <w:p>
+            <w:r>
+              <w:t>3</w:t>
+            </w:r>
+          </w:p>
+        </w:tc>
+        <w:tc>
+          <w:tcPr>
+            <w:tcW w:w="1098" w:type="dxa"/>
+          </w:tcPr>
+          <w:p>
+            <w:r>
+              <w:t>4</w:t>
+            </w:r>
+          </w:p>
+        </w:tc>
+        <w:tc>
+          <w:tcPr>
+            <w:tcW w:w="1099" w:type="dxa"/>
+          </w:tcPr>
+          <w:p>
+            <w:r>
+              <w:t>5</w:t>
+            </w:r>
+          </w:p>
+        </w:tc>
+      </w:tr>
+      <w:tr>
+        <w:tc>
+          <w:tcPr>
+            <w:tcW w:w="2122" w:type="dxa"/>
+          </w:tcPr>
+          <w:p>
+            <w:r>
+              <w:t>Initial ACE</w:t>
+            </w:r>
+          </w:p>
+        </w:tc>
+        <w:tc>
+          <w:tcPr>
+            <w:tcW w:w="1098" w:type="dxa"/>
+          </w:tcPr>
+          <w:p>
+            <w:r>
+              <w:t>1500kJ</w:t>
+            </w:r>
+          </w:p>
+        </w:tc>
+        <w:tc>
+          <w:tcPr>
+            <w:tcW w:w="1099" w:type="dxa"/>
+          </w:tcPr>
+          <w:p>
+            <w:r>
+              <w:t>2000kJ</w:t>
+            </w:r>
+          </w:p>
+        </w:tc>
+        <w:tc>
+          <w:tcPr>
+            <w:tcW w:w="1098" w:type="dxa"/>
+          </w:tcPr>
+          <w:p>
+            <w:r>
+              <w:t>2500kJ</w:t>
+            </w:r>
+          </w:p>
+        </w:tc>
+        <w:tc>
+          <w:tcPr>
+            <w:tcW w:w="1099" w:type="dxa"/>
+          </w:tcPr>
+          <w:p>
+            <w:r>
+              <w:t>3000kJ</w:t>
+            </w:r>
+          </w:p>
+        </w:tc>
+      </w:tr>
+    </w:tbl>
     <w:p/>
     <w:p>
       <w:r>
@@ -3526,10 +3645,7 @@
         <w:t xml:space="preserve">The final score is the sum of your ACE points (in kJ), landfall costs (in millions $), and the two bonus points for </w:t>
       </w:r>
       <w:r>
-        <w:t>most landfalling cities</w:t>
-      </w:r>
-      <w:r>
-        <w:t xml:space="preserve"> and </w:t>
+        <w:t xml:space="preserve">most landfalling cities and </w:t>
       </w:r>
       <w:r>
         <w:t>highest peak intensity.</w:t>

</xml_diff>